<commit_message>
Add per-class metrics table and speed and interpretability reasoning to the paper
</commit_message>
<xml_diff>
--- a/paper/paper.docx
+++ b/paper/paper.docx
@@ -2154,7 +2154,7 @@
         <w:jc w:val="both"/>
       </w:pPr>
       <w:r>
-        <w:t>Table III and Fig. 4 show the cross-validation results. The three models were almost identical: mean F2 0.578 to 0.580 and ROC-AUC 0.758 to 0.770, with differences much smaller than the fold-to-fold spread. All beat referring everyone (0.498), but none clearly beat the risk-factor rule (0.576). Gradient Boosting had the highest mean F2 by 0.0001 over Random Forest, which was within one standard deviation, so the pre-registered rule selected Random Forest (maximum depth unlimited, minimum leaf size 20). Random Forest also had the highest ROC-AUC and PR-AUC, the lowest Brier score and the smallest spread across folds. All models were poorly calibrated because of the balanced class weights: a score of about 0.8 corresponded to an observed CKD rate of about 0.5 (Fig. 5).</w:t>
+        <w:t>Table III and Fig. 4 show the cross-validation results; accuracy and per-class precision, recall and F1 for all three models are in Table IV (Appendix C). The three models were almost identical: mean F2 0.578 to 0.580 and ROC-AUC 0.758 to 0.770, with differences much smaller than the fold-to-fold spread. All beat referring everyone (0.498), but none clearly beat the risk-factor rule (0.576). Gradient Boosting had the highest mean F2 by 0.0001 over Random Forest, which was within one standard deviation, so the pre-registered rule selected Random Forest (maximum depth unlimited, minimum leaf size 20). Random Forest also had the highest ROC-AUC and PR-AUC, the lowest Brier score and the smallest spread across folds. All models were poorly calibrated because of the balanced class weights: a score of about 0.8 corresponded to an observed CKD rate of about 0.5 (Fig. 5).</w:t>
       </w:r>
     </w:p>
     <w:p>
@@ -3151,6 +3151,15 @@
       </w:pPr>
       <w:r>
         <w:t>On NHANES, the three algorithms reached the same ceiling. When the features are a handful of risk factors, there is little non-linear structure for Random Forest or Gradient Boosting to exploit, and Logistic Regression already captures most of the signal. Random Forest was selected by the tie-break rule rather than because it was clearly better, and Logistic Regression would have been an equally defensible choice. I kept Random Forest because changing the choice after seeing the results would break the pre-registration, and because it ranked patients slightly better (cross-validated ROC-AUC 0.770 against 0.758, with the best PR-AUC and Brier score), which is where its value turned out to be. The model did not beat the risk-factor rule on F2: the test-set difference was 0.003 (95% CI -0.017 to 0.024). Its practical advantage is ranking. When both refer 804 people they find almost the same cases, but when a health unit can test only 300 or 500 of 1,473 people, the model finds 15.2 and 13.0 more cases than a points rule. The tenth of training patients with the highest scores had CKD 50% of the time, against 3.7% in the lowest tenth. This gain is modest, post-hoc and limited to that range of capacity, so I present the model as a ranking aid, not a better classifier.</w:t>
+      </w:r>
+    </w:p>
+    <w:p>
+      <w:pPr>
+        <w:ind w:firstLine="216"/>
+        <w:jc w:val="both"/>
+      </w:pPr>
+      <w:r>
+        <w:t>On the other selection criteria the models were also close. Grid search with threshold tuning took 46 s for Logistic Regression, 135 s for Random Forest and 165 s for Gradient Boosting on my computer, and each model scores a patient instantly, so speed did not separate them. Logistic Regression is the easiest to interpret, because each coefficient shows the direction and size of a feature's effect. Random Forest needs permutation importance to be explained (Fig. 7), and it gave a clinically sensible order: age, then diabetes and systolic blood pressure. For practical use, the saved Random Forest pipeline is 5.4 MB and runs in the Streamlit app without delay. I accept the small loss in interpretability for the slightly better ranking.</w:t>
       </w:r>
     </w:p>
     <w:p>
@@ -4645,7 +4654,7 @@
         <w:pStyle w:val="Heading2"/>
       </w:pPr>
       <w:r>
-        <w:t>Appendix C. Additional figures</w:t>
+        <w:t>Appendix C. Additional figures and tables</w:t>
       </w:r>
     </w:p>
     <w:p>
@@ -4769,6 +4778,732 @@
     <w:p>
       <w:r>
         <w:t>ROC-AUC of each UCI feature on its own, colored by tier.</w:t>
+      </w:r>
+    </w:p>
+    <w:p>
+      <w:pPr>
+        <w:keepNext/>
+        <w:jc w:val="center"/>
+      </w:pPr>
+      <w:r>
+        <w:rPr>
+          <w:sz w:val="16"/>
+        </w:rPr>
+        <w:t>TABLE IV</w:t>
+        <w:br/>
+        <w:t>ACCURACY AND PER-CLASS METRICS FOR ALL THREE MODELS</w:t>
+      </w:r>
+    </w:p>
+    <w:tbl>
+      <w:tblPr>
+        <w:tblStyle w:val="TableGrid"/>
+        <w:tblW w:type="auto" w:w="0"/>
+        <w:tblLook w:firstColumn="1" w:firstRow="1" w:lastColumn="0" w:lastRow="0" w:noHBand="0" w:noVBand="1" w:val="04A0"/>
+      </w:tblPr>
+      <w:tblGrid>
+        <w:gridCol w:w="1305"/>
+        <w:gridCol w:w="1305"/>
+        <w:gridCol w:w="1305"/>
+        <w:gridCol w:w="1305"/>
+        <w:gridCol w:w="1305"/>
+        <w:gridCol w:w="1305"/>
+        <w:gridCol w:w="1305"/>
+        <w:gridCol w:w="1305"/>
+      </w:tblGrid>
+      <w:tr>
+        <w:tc>
+          <w:tcPr>
+            <w:tcW w:type="dxa" w:w="1305"/>
+          </w:tcPr>
+          <w:p>
+            <w:pPr>
+              <w:jc w:val="left"/>
+            </w:pPr>
+            <w:r>
+              <w:rPr>
+                <w:b/>
+                <w:sz w:val="16"/>
+              </w:rPr>
+              <w:t>Model</w:t>
+            </w:r>
+          </w:p>
+        </w:tc>
+        <w:tc>
+          <w:tcPr>
+            <w:tcW w:type="dxa" w:w="1305"/>
+          </w:tcPr>
+          <w:p>
+            <w:pPr>
+              <w:jc w:val="center"/>
+            </w:pPr>
+            <w:r>
+              <w:rPr>
+                <w:b/>
+                <w:sz w:val="16"/>
+              </w:rPr>
+              <w:t>Accuracy</w:t>
+            </w:r>
+          </w:p>
+        </w:tc>
+        <w:tc>
+          <w:tcPr>
+            <w:tcW w:type="dxa" w:w="1305"/>
+          </w:tcPr>
+          <w:p>
+            <w:pPr>
+              <w:jc w:val="center"/>
+            </w:pPr>
+            <w:r>
+              <w:rPr>
+                <w:b/>
+                <w:sz w:val="16"/>
+              </w:rPr>
+              <w:t>CKD precision</w:t>
+            </w:r>
+          </w:p>
+        </w:tc>
+        <w:tc>
+          <w:tcPr>
+            <w:tcW w:type="dxa" w:w="1305"/>
+          </w:tcPr>
+          <w:p>
+            <w:pPr>
+              <w:jc w:val="center"/>
+            </w:pPr>
+            <w:r>
+              <w:rPr>
+                <w:b/>
+                <w:sz w:val="16"/>
+              </w:rPr>
+              <w:t>CKD recall</w:t>
+            </w:r>
+          </w:p>
+        </w:tc>
+        <w:tc>
+          <w:tcPr>
+            <w:tcW w:type="dxa" w:w="1305"/>
+          </w:tcPr>
+          <w:p>
+            <w:pPr>
+              <w:jc w:val="center"/>
+            </w:pPr>
+            <w:r>
+              <w:rPr>
+                <w:b/>
+                <w:sz w:val="16"/>
+              </w:rPr>
+              <w:t>CKD F1</w:t>
+            </w:r>
+          </w:p>
+        </w:tc>
+        <w:tc>
+          <w:tcPr>
+            <w:tcW w:type="dxa" w:w="1305"/>
+          </w:tcPr>
+          <w:p>
+            <w:pPr>
+              <w:jc w:val="center"/>
+            </w:pPr>
+            <w:r>
+              <w:rPr>
+                <w:b/>
+                <w:sz w:val="16"/>
+              </w:rPr>
+              <w:t>No-CKD precision</w:t>
+            </w:r>
+          </w:p>
+        </w:tc>
+        <w:tc>
+          <w:tcPr>
+            <w:tcW w:type="dxa" w:w="1305"/>
+          </w:tcPr>
+          <w:p>
+            <w:pPr>
+              <w:jc w:val="center"/>
+            </w:pPr>
+            <w:r>
+              <w:rPr>
+                <w:b/>
+                <w:sz w:val="16"/>
+              </w:rPr>
+              <w:t>No-CKD recall</w:t>
+            </w:r>
+          </w:p>
+        </w:tc>
+        <w:tc>
+          <w:tcPr>
+            <w:tcW w:type="dxa" w:w="1305"/>
+          </w:tcPr>
+          <w:p>
+            <w:pPr>
+              <w:jc w:val="center"/>
+            </w:pPr>
+            <w:r>
+              <w:rPr>
+                <w:b/>
+                <w:sz w:val="16"/>
+              </w:rPr>
+              <w:t>No-CKD F1</w:t>
+            </w:r>
+          </w:p>
+        </w:tc>
+      </w:tr>
+      <w:tr>
+        <w:tc>
+          <w:tcPr>
+            <w:tcW w:type="dxa" w:w="1305"/>
+          </w:tcPr>
+          <w:p>
+            <w:pPr>
+              <w:jc w:val="left"/>
+            </w:pPr>
+            <w:r>
+              <w:rPr>
+                <w:b w:val="0"/>
+                <w:sz w:val="16"/>
+              </w:rPr>
+              <w:t>Logistic Regression (CV)</w:t>
+            </w:r>
+          </w:p>
+        </w:tc>
+        <w:tc>
+          <w:tcPr>
+            <w:tcW w:type="dxa" w:w="1305"/>
+          </w:tcPr>
+          <w:p>
+            <w:pPr>
+              <w:jc w:val="center"/>
+            </w:pPr>
+            <w:r>
+              <w:rPr>
+                <w:b w:val="0"/>
+                <w:sz w:val="16"/>
+              </w:rPr>
+              <w:t>0.624</w:t>
+            </w:r>
+          </w:p>
+        </w:tc>
+        <w:tc>
+          <w:tcPr>
+            <w:tcW w:type="dxa" w:w="1305"/>
+          </w:tcPr>
+          <w:p>
+            <w:pPr>
+              <w:jc w:val="center"/>
+            </w:pPr>
+            <w:r>
+              <w:rPr>
+                <w:b w:val="0"/>
+                <w:sz w:val="16"/>
+              </w:rPr>
+              <w:t>0.277</w:t>
+            </w:r>
+          </w:p>
+        </w:tc>
+        <w:tc>
+          <w:tcPr>
+            <w:tcW w:type="dxa" w:w="1305"/>
+          </w:tcPr>
+          <w:p>
+            <w:pPr>
+              <w:jc w:val="center"/>
+            </w:pPr>
+            <w:r>
+              <w:rPr>
+                <w:b w:val="0"/>
+                <w:sz w:val="16"/>
+              </w:rPr>
+              <w:t>0.793</w:t>
+            </w:r>
+          </w:p>
+        </w:tc>
+        <w:tc>
+          <w:tcPr>
+            <w:tcW w:type="dxa" w:w="1305"/>
+          </w:tcPr>
+          <w:p>
+            <w:pPr>
+              <w:jc w:val="center"/>
+            </w:pPr>
+            <w:r>
+              <w:rPr>
+                <w:b w:val="0"/>
+                <w:sz w:val="16"/>
+              </w:rPr>
+              <w:t>0.411</w:t>
+            </w:r>
+          </w:p>
+        </w:tc>
+        <w:tc>
+          <w:tcPr>
+            <w:tcW w:type="dxa" w:w="1305"/>
+          </w:tcPr>
+          <w:p>
+            <w:pPr>
+              <w:jc w:val="center"/>
+            </w:pPr>
+            <w:r>
+              <w:rPr>
+                <w:b w:val="0"/>
+                <w:sz w:val="16"/>
+              </w:rPr>
+              <w:t>0.935</w:t>
+            </w:r>
+          </w:p>
+        </w:tc>
+        <w:tc>
+          <w:tcPr>
+            <w:tcW w:type="dxa" w:w="1305"/>
+          </w:tcPr>
+          <w:p>
+            <w:pPr>
+              <w:jc w:val="center"/>
+            </w:pPr>
+            <w:r>
+              <w:rPr>
+                <w:b w:val="0"/>
+                <w:sz w:val="16"/>
+              </w:rPr>
+              <w:t>0.591</w:t>
+            </w:r>
+          </w:p>
+        </w:tc>
+        <w:tc>
+          <w:tcPr>
+            <w:tcW w:type="dxa" w:w="1305"/>
+          </w:tcPr>
+          <w:p>
+            <w:pPr>
+              <w:jc w:val="center"/>
+            </w:pPr>
+            <w:r>
+              <w:rPr>
+                <w:b w:val="0"/>
+                <w:sz w:val="16"/>
+              </w:rPr>
+              <w:t>0.724</w:t>
+            </w:r>
+          </w:p>
+        </w:tc>
+      </w:tr>
+      <w:tr>
+        <w:tc>
+          <w:tcPr>
+            <w:tcW w:type="dxa" w:w="1305"/>
+          </w:tcPr>
+          <w:p>
+            <w:pPr>
+              <w:jc w:val="left"/>
+            </w:pPr>
+            <w:r>
+              <w:rPr>
+                <w:b w:val="0"/>
+                <w:sz w:val="16"/>
+              </w:rPr>
+              <w:t>Random Forest (CV)</w:t>
+            </w:r>
+          </w:p>
+        </w:tc>
+        <w:tc>
+          <w:tcPr>
+            <w:tcW w:type="dxa" w:w="1305"/>
+          </w:tcPr>
+          <w:p>
+            <w:pPr>
+              <w:jc w:val="center"/>
+            </w:pPr>
+            <w:r>
+              <w:rPr>
+                <w:b w:val="0"/>
+                <w:sz w:val="16"/>
+              </w:rPr>
+              <w:t>0.598</w:t>
+            </w:r>
+          </w:p>
+        </w:tc>
+        <w:tc>
+          <w:tcPr>
+            <w:tcW w:type="dxa" w:w="1305"/>
+          </w:tcPr>
+          <w:p>
+            <w:pPr>
+              <w:jc w:val="center"/>
+            </w:pPr>
+            <w:r>
+              <w:rPr>
+                <w:b w:val="0"/>
+                <w:sz w:val="16"/>
+              </w:rPr>
+              <w:t>0.267</w:t>
+            </w:r>
+          </w:p>
+        </w:tc>
+        <w:tc>
+          <w:tcPr>
+            <w:tcW w:type="dxa" w:w="1305"/>
+          </w:tcPr>
+          <w:p>
+            <w:pPr>
+              <w:jc w:val="center"/>
+            </w:pPr>
+            <w:r>
+              <w:rPr>
+                <w:b w:val="0"/>
+                <w:sz w:val="16"/>
+              </w:rPr>
+              <w:t>0.819</w:t>
+            </w:r>
+          </w:p>
+        </w:tc>
+        <w:tc>
+          <w:tcPr>
+            <w:tcW w:type="dxa" w:w="1305"/>
+          </w:tcPr>
+          <w:p>
+            <w:pPr>
+              <w:jc w:val="center"/>
+            </w:pPr>
+            <w:r>
+              <w:rPr>
+                <w:b w:val="0"/>
+                <w:sz w:val="16"/>
+              </w:rPr>
+              <w:t>0.403</w:t>
+            </w:r>
+          </w:p>
+        </w:tc>
+        <w:tc>
+          <w:tcPr>
+            <w:tcW w:type="dxa" w:w="1305"/>
+          </w:tcPr>
+          <w:p>
+            <w:pPr>
+              <w:jc w:val="center"/>
+            </w:pPr>
+            <w:r>
+              <w:rPr>
+                <w:b w:val="0"/>
+                <w:sz w:val="16"/>
+              </w:rPr>
+              <w:t>0.939</w:t>
+            </w:r>
+          </w:p>
+        </w:tc>
+        <w:tc>
+          <w:tcPr>
+            <w:tcW w:type="dxa" w:w="1305"/>
+          </w:tcPr>
+          <w:p>
+            <w:pPr>
+              <w:jc w:val="center"/>
+            </w:pPr>
+            <w:r>
+              <w:rPr>
+                <w:b w:val="0"/>
+                <w:sz w:val="16"/>
+              </w:rPr>
+              <w:t>0.554</w:t>
+            </w:r>
+          </w:p>
+        </w:tc>
+        <w:tc>
+          <w:tcPr>
+            <w:tcW w:type="dxa" w:w="1305"/>
+          </w:tcPr>
+          <w:p>
+            <w:pPr>
+              <w:jc w:val="center"/>
+            </w:pPr>
+            <w:r>
+              <w:rPr>
+                <w:b w:val="0"/>
+                <w:sz w:val="16"/>
+              </w:rPr>
+              <w:t>0.697</w:t>
+            </w:r>
+          </w:p>
+        </w:tc>
+      </w:tr>
+      <w:tr>
+        <w:tc>
+          <w:tcPr>
+            <w:tcW w:type="dxa" w:w="1305"/>
+          </w:tcPr>
+          <w:p>
+            <w:pPr>
+              <w:jc w:val="left"/>
+            </w:pPr>
+            <w:r>
+              <w:rPr>
+                <w:b w:val="0"/>
+                <w:sz w:val="16"/>
+              </w:rPr>
+              <w:t>Gradient Boosting (CV)</w:t>
+            </w:r>
+          </w:p>
+        </w:tc>
+        <w:tc>
+          <w:tcPr>
+            <w:tcW w:type="dxa" w:w="1305"/>
+          </w:tcPr>
+          <w:p>
+            <w:pPr>
+              <w:jc w:val="center"/>
+            </w:pPr>
+            <w:r>
+              <w:rPr>
+                <w:b w:val="0"/>
+                <w:sz w:val="16"/>
+              </w:rPr>
+              <w:t>0.631</w:t>
+            </w:r>
+          </w:p>
+        </w:tc>
+        <w:tc>
+          <w:tcPr>
+            <w:tcW w:type="dxa" w:w="1305"/>
+          </w:tcPr>
+          <w:p>
+            <w:pPr>
+              <w:jc w:val="center"/>
+            </w:pPr>
+            <w:r>
+              <w:rPr>
+                <w:b w:val="0"/>
+                <w:sz w:val="16"/>
+              </w:rPr>
+              <w:t>0.281</w:t>
+            </w:r>
+          </w:p>
+        </w:tc>
+        <w:tc>
+          <w:tcPr>
+            <w:tcW w:type="dxa" w:w="1305"/>
+          </w:tcPr>
+          <w:p>
+            <w:pPr>
+              <w:jc w:val="center"/>
+            </w:pPr>
+            <w:r>
+              <w:rPr>
+                <w:b w:val="0"/>
+                <w:sz w:val="16"/>
+              </w:rPr>
+              <w:t>0.791</w:t>
+            </w:r>
+          </w:p>
+        </w:tc>
+        <w:tc>
+          <w:tcPr>
+            <w:tcW w:type="dxa" w:w="1305"/>
+          </w:tcPr>
+          <w:p>
+            <w:pPr>
+              <w:jc w:val="center"/>
+            </w:pPr>
+            <w:r>
+              <w:rPr>
+                <w:b w:val="0"/>
+                <w:sz w:val="16"/>
+              </w:rPr>
+              <w:t>0.415</w:t>
+            </w:r>
+          </w:p>
+        </w:tc>
+        <w:tc>
+          <w:tcPr>
+            <w:tcW w:type="dxa" w:w="1305"/>
+          </w:tcPr>
+          <w:p>
+            <w:pPr>
+              <w:jc w:val="center"/>
+            </w:pPr>
+            <w:r>
+              <w:rPr>
+                <w:b w:val="0"/>
+                <w:sz w:val="16"/>
+              </w:rPr>
+              <w:t>0.935</w:t>
+            </w:r>
+          </w:p>
+        </w:tc>
+        <w:tc>
+          <w:tcPr>
+            <w:tcW w:type="dxa" w:w="1305"/>
+          </w:tcPr>
+          <w:p>
+            <w:pPr>
+              <w:jc w:val="center"/>
+            </w:pPr>
+            <w:r>
+              <w:rPr>
+                <w:b w:val="0"/>
+                <w:sz w:val="16"/>
+              </w:rPr>
+              <w:t>0.599</w:t>
+            </w:r>
+          </w:p>
+        </w:tc>
+        <w:tc>
+          <w:tcPr>
+            <w:tcW w:type="dxa" w:w="1305"/>
+          </w:tcPr>
+          <w:p>
+            <w:pPr>
+              <w:jc w:val="center"/>
+            </w:pPr>
+            <w:r>
+              <w:rPr>
+                <w:b w:val="0"/>
+                <w:sz w:val="16"/>
+              </w:rPr>
+              <w:t>0.731</w:t>
+            </w:r>
+          </w:p>
+        </w:tc>
+      </w:tr>
+      <w:tr>
+        <w:tc>
+          <w:tcPr>
+            <w:tcW w:type="dxa" w:w="1305"/>
+          </w:tcPr>
+          <w:p>
+            <w:pPr>
+              <w:jc w:val="left"/>
+            </w:pPr>
+            <w:r>
+              <w:rPr>
+                <w:b w:val="0"/>
+                <w:sz w:val="16"/>
+              </w:rPr>
+              <w:t>Random Forest (test)</w:t>
+            </w:r>
+          </w:p>
+        </w:tc>
+        <w:tc>
+          <w:tcPr>
+            <w:tcW w:type="dxa" w:w="1305"/>
+          </w:tcPr>
+          <w:p>
+            <w:pPr>
+              <w:jc w:val="center"/>
+            </w:pPr>
+            <w:r>
+              <w:rPr>
+                <w:b w:val="0"/>
+                <w:sz w:val="16"/>
+              </w:rPr>
+              <w:t>0.563</w:t>
+            </w:r>
+          </w:p>
+        </w:tc>
+        <w:tc>
+          <w:tcPr>
+            <w:tcW w:type="dxa" w:w="1305"/>
+          </w:tcPr>
+          <w:p>
+            <w:pPr>
+              <w:jc w:val="center"/>
+            </w:pPr>
+            <w:r>
+              <w:rPr>
+                <w:b w:val="0"/>
+                <w:sz w:val="16"/>
+              </w:rPr>
+              <w:t>0.256</w:t>
+            </w:r>
+          </w:p>
+        </w:tc>
+        <w:tc>
+          <w:tcPr>
+            <w:tcW w:type="dxa" w:w="1305"/>
+          </w:tcPr>
+          <w:p>
+            <w:pPr>
+              <w:jc w:val="center"/>
+            </w:pPr>
+            <w:r>
+              <w:rPr>
+                <w:b w:val="0"/>
+                <w:sz w:val="16"/>
+              </w:rPr>
+              <w:t>0.864</w:t>
+            </w:r>
+          </w:p>
+        </w:tc>
+        <w:tc>
+          <w:tcPr>
+            <w:tcW w:type="dxa" w:w="1305"/>
+          </w:tcPr>
+          <w:p>
+            <w:pPr>
+              <w:jc w:val="center"/>
+            </w:pPr>
+            <w:r>
+              <w:rPr>
+                <w:b w:val="0"/>
+                <w:sz w:val="16"/>
+              </w:rPr>
+              <w:t>0.395</w:t>
+            </w:r>
+          </w:p>
+        </w:tc>
+        <w:tc>
+          <w:tcPr>
+            <w:tcW w:type="dxa" w:w="1305"/>
+          </w:tcPr>
+          <w:p>
+            <w:pPr>
+              <w:jc w:val="center"/>
+            </w:pPr>
+            <w:r>
+              <w:rPr>
+                <w:b w:val="0"/>
+                <w:sz w:val="16"/>
+              </w:rPr>
+              <w:t>0.949</w:t>
+            </w:r>
+          </w:p>
+        </w:tc>
+        <w:tc>
+          <w:tcPr>
+            <w:tcW w:type="dxa" w:w="1305"/>
+          </w:tcPr>
+          <w:p>
+            <w:pPr>
+              <w:jc w:val="center"/>
+            </w:pPr>
+            <w:r>
+              <w:rPr>
+                <w:b w:val="0"/>
+                <w:sz w:val="16"/>
+              </w:rPr>
+              <w:t>0.504</w:t>
+            </w:r>
+          </w:p>
+        </w:tc>
+        <w:tc>
+          <w:tcPr>
+            <w:tcW w:type="dxa" w:w="1305"/>
+          </w:tcPr>
+          <w:p>
+            <w:pPr>
+              <w:jc w:val="center"/>
+            </w:pPr>
+            <w:r>
+              <w:rPr>
+                <w:b w:val="0"/>
+                <w:sz w:val="16"/>
+              </w:rPr>
+              <w:t>0.659</w:t>
+            </w:r>
+          </w:p>
+        </w:tc>
+      </w:tr>
+    </w:tbl>
+    <w:p>
+      <w:r>
+        <w:t>CV rows use the pooled out-of-fold predictions on the 5,890 training adults at each model's tuned threshold; the last row is the selected model on the 1,473 test adults. No-CKD recall is the specificity.</w:t>
       </w:r>
     </w:p>
     <w:p>

</xml_diff>

<commit_message>
Cite the deployed app as a reference instead of an inline URL
</commit_message>
<xml_diff>
--- a/paper/paper.docx
+++ b/paper/paper.docx
@@ -497,7 +497,7 @@
         <w:jc w:val="both"/>
       </w:pPr>
       <w:r>
-        <w:t>The selected pipeline, including preprocessing and the tuned threshold, was saved with joblib and loaded by a Streamlit [11] application. The deployed application is available at https://intro-ml-final-k5xt73im3xwcggoc8x3mws.streamlit.app/. The application accepts one patient through a validated form or several through a CSV upload, and it rejects missing, invalid or out-of-range inputs with a readable message. For a CSV upload, the user can also enter the number of available tests, and only that many patients are referred, highest scores first. It was tested with automated tests covering valid, invalid and boundary inputs.</w:t>
+        <w:t>The selected pipeline, including preprocessing and the tuned threshold, was saved with joblib and loaded by a Streamlit [11] application. The deployed application is available online [12]. The application accepts one patient through a validated form or several through a CSV upload, and it rejects missing, invalid or out-of-range inputs with a readable message. For a CSV upload, the user can also enter the number of available tests, and only that many patients are referred, highest scores first. It was tested with automated tests covering valid, invalid and boundary inputs.</w:t>
       </w:r>
     </w:p>
     <w:p>
@@ -3442,6 +3442,18 @@
     </w:p>
     <w:p>
       <w:pPr>
+        <w:ind w:left="360" w:hanging="360"/>
+        <w:jc w:val="both"/>
+      </w:pPr>
+      <w:r>
+        <w:rPr>
+          <w:sz w:val="16"/>
+        </w:rPr>
+        <w:t>[12]  A. Garcia, “Pre-lab CKD Early Detection using Random Forest,” web application, 2026. [Online]. Available: https://intro-ml-final-k5xt73im3xwcggoc8x3mws.streamlit.app/</w:t>
+      </w:r>
+    </w:p>
+    <w:p>
+      <w:pPr>
         <w:sectPr>
           <w:type w:val="continuous"/>
           <w:pgSz w:w="12240" w:h="15840"/>

</xml_diff>